<commit_message>
📝 Prepare for Meeting
Changed the meeting minutes, added an alternative dataset, scoped down the topic
</commit_message>
<xml_diff>
--- a/docs/Supervisor Meetings/Meeting 21.04.docx
+++ b/docs/Supervisor Meetings/Meeting 21.04.docx
@@ -165,6 +165,9 @@
       <w:r>
         <w:t>, found a specific approach</w:t>
       </w:r>
+      <w:r>
+        <w:t>, found an alternative dataset</w:t>
+      </w:r>
     </w:p>
     <w:p>
       <w:pPr>
@@ -180,7 +183,20 @@
         <w:t>Challenges Faced:</w:t>
       </w:r>
       <w:r>
-        <w:t xml:space="preserve"> [List key issues]</w:t>
+        <w:t xml:space="preserve"> </w:t>
+      </w:r>
+      <w:r>
+        <w:t xml:space="preserve">how to split the data? By </w:t>
+      </w:r>
+      <w:r>
+        <w:rPr>
+          <w:i/>
+          <w:iCs/>
+        </w:rPr>
+        <w:t>Genre</w:t>
+      </w:r>
+      <w:r>
+        <w:t>? Country seems difficult to do with the current data.</w:t>
       </w:r>
     </w:p>
     <w:p>

</xml_diff>